<commit_message>
Aula 1: explicar o padrao categoria (Eixo X) x valor numerico (Valores) no primeiro grafico
</commit_message>
<xml_diff>
--- a/Aula 01 - 01-09-2026/Aula 1 - Apostila do Aluno.docx
+++ b/Aula 01 - 01-09-2026/Aula 1 - Apostila do Aluno.docx
@@ -520,7 +520,7 @@
         <w:pStyle w:val="Numerada"/>
       </w:pPr>
       <w:r>
-        <w:t>2. No painel Dados, arraste o campo "Região" para a área "Eixo X" do visual.</w:t>
+        <w:t>2. No painel Dados, arraste o campo "Região" para a área "Eixo X" do visual — é ali que entra o campo categórico, aquele que queremos comparar.</w:t>
       </w:r>
     </w:p>
     <w:p>
@@ -528,7 +528,7 @@
         <w:pStyle w:val="Numerada"/>
       </w:pPr>
       <w:r>
-        <w:t>3. Arraste o campo "Valor Total" para a área "Valores" do visual.</w:t>
+        <w:t>3. Arraste o campo "Valor Total" para a área "Valores" do visual — é ali que entra o campo numérico, que o Power BI soma automaticamente para cada categoria do eixo.</w:t>
       </w:r>
     </w:p>
     <w:p>

</xml_diff>

<commit_message>
Aula 1: ajustar explicacao do Eixo X/Y como paragrafo proprio, nao colado nos passos
</commit_message>
<xml_diff>
--- a/Aula 01 - 01-09-2026/Aula 1 - Apostila do Aluno.docx
+++ b/Aula 01 - 01-09-2026/Aula 1 - Apostila do Aluno.docx
@@ -520,7 +520,7 @@
         <w:pStyle w:val="Numerada"/>
       </w:pPr>
       <w:r>
-        <w:t>2. No painel Dados, arraste o campo "Região" para a área "Eixo X" do visual — é ali que entra o campo categórico, aquele que queremos comparar.</w:t>
+        <w:t>2. No painel Dados, arraste o campo "Região" para a área "Eixo X" do visual.</w:t>
       </w:r>
     </w:p>
     <w:p>
@@ -528,7 +528,7 @@
         <w:pStyle w:val="Numerada"/>
       </w:pPr>
       <w:r>
-        <w:t>3. Arraste o campo "Valor Total" para a área "Valores" do visual — é ali que entra o campo numérico, que o Power BI soma automaticamente para cada categoria do eixo.</w:t>
+        <w:t>3. Arraste o campo "Valor Total" para a área "Valores" do visual.</w:t>
       </w:r>
     </w:p>
     <w:p>
@@ -537,6 +537,12 @@
       </w:pPr>
       <w:r>
         <w:t>4. Observe o gráfico sendo montado automaticamente, somando o Valor Total por Região.</w:t>
+      </w:r>
+    </w:p>
+    <w:p>
+      <w:pPr/>
+      <w:r>
+        <w:t>Por que assim? No gráfico de colunas, o Eixo X (horizontal) recebe a categoria que você quer comparar (Região); o Eixo Y (a altura da coluna, campo Valores) mostra o total somado de cada uma — por isso dá pra ver de cara qual região vendeu mais.</w:t>
       </w:r>
     </w:p>
     <w:p>

</xml_diff>

<commit_message>
Atualiza apostilas e slides de todas as aulas
</commit_message>
<xml_diff>
--- a/Aula 01 - 01-09-2026/Aula 1 - Apostila do Aluno.docx
+++ b/Aula 01 - 01-09-2026/Aula 1 - Apostila do Aluno.docx
@@ -12,7 +12,7 @@
           <w:color w:val="1F497D"/>
           <w:sz w:val="40"/>
         </w:rPr>
-        <w:t>APOSTILA DO ALUNO — AULA 1</w:t>
+        <w:t>APOSTILA DO ALUNO - AULA 1</w:t>
       </w:r>
     </w:p>
     <w:p>
@@ -23,7 +23,7 @@
         <w:rPr>
           <w:sz w:val="26"/>
         </w:rPr>
-        <w:t>Microsoft Power BI Desktop — Introdução ao Power BI Desktop</w:t>
+        <w:t>Microsoft Power BI Desktop - Introdução ao Power BI Desktop</w:t>
       </w:r>
     </w:p>
     <w:p>
@@ -122,7 +122,7 @@
     </w:p>
     <w:p>
       <w:r>
-        <w:t>Exemplo: uma lista com 10 mil linhas de vendas é um dado bruto — difícil de interpretar sozinho. Quando somamos essas vendas por região e por mês, temos informação. Quando percebemos que uma região específica está com queda recorrente nos últimos três meses, temos conhecimento — e isso permite tomar uma decisão (reforçar a equipe comercial, investigar a causa, etc.).</w:t>
+        <w:t>Exemplo: uma lista com 10 mil linhas de vendas é um dado bruto, difícil de interpretar sozinho. Quando somamos essas vendas por região e por mês, temos informação. Quando percebemos que uma região específica está com queda recorrente nos últimos três meses, temos conhecimento. Isso permite tomar uma decisão (reforçar a equipe comercial, investigar a causa, etc.).</w:t>
       </w:r>
     </w:p>
     <w:p>
@@ -163,7 +163,7 @@
     </w:p>
     <w:p>
       <w:r>
-        <w:t>O Power BI não é uma ferramenta única — é um conjunto de aplicativos que trabalham juntos:</w:t>
+        <w:t>O Power BI não é uma ferramenta única, e sim um conjunto de aplicativos que trabalham juntos:</w:t>
       </w:r>
     </w:p>
     <w:tbl>
@@ -332,7 +332,7 @@
         <w:pStyle w:val="Commarcadores"/>
       </w:pPr>
       <w:r>
-        <w:t>Relatório — é a tela principal, onde você monta os gráficos, tabelas e cartões que formam o seu painel visual.</w:t>
+        <w:t>Relatório: é a tela principal, onde você monta os gráficos, tabelas e cartões que formam o seu painel visual.</w:t>
       </w:r>
     </w:p>
     <w:p>
@@ -340,7 +340,7 @@
         <w:pStyle w:val="Commarcadores"/>
       </w:pPr>
       <w:r>
-        <w:t>Dados — mostra as tabelas carregadas linha por linha, como uma planilha. Serve para conferir os dados e criar colunas calculadas.</w:t>
+        <w:t>Dados: mostra as tabelas carregadas linha por linha, como uma planilha. Serve para conferir os dados e criar colunas calculadas.</w:t>
       </w:r>
     </w:p>
     <w:p>
@@ -348,7 +348,7 @@
         <w:pStyle w:val="Commarcadores"/>
       </w:pPr>
       <w:r>
-        <w:t>Modelo — mostra as tabelas em formato de caixas e os relacionamentos (linhas) entre elas. Fica mais importante quando trabalhamos com mais de uma tabela (a partir da Aula 3).</w:t>
+        <w:t>Modelo: mostra as tabelas em formato de caixas e os relacionamentos (linhas) entre elas. Fica mais importante quando trabalhamos com mais de uma tabela (a partir da Aula 3).</w:t>
       </w:r>
     </w:p>
     <w:p>
@@ -367,7 +367,7 @@
         <w:pStyle w:val="Commarcadores"/>
       </w:pPr>
       <w:r>
-        <w:t>Painel Dados — lista todas as tabelas e colunas disponíveis para uso nos visuais.</w:t>
+        <w:t>Painel Dados: lista todas as tabelas e colunas disponíveis para uso nos visuais.</w:t>
       </w:r>
     </w:p>
     <w:p>
@@ -375,7 +375,7 @@
         <w:pStyle w:val="Commarcadores"/>
       </w:pPr>
       <w:r>
-        <w:t>Painel Filtros — permite aplicar filtros ao relatório inteiro, a uma página ou a um visual específico.</w:t>
+        <w:t>Painel Filtros: permite aplicar filtros ao relatório inteiro, a uma página ou a um visual específico.</w:t>
       </w:r>
     </w:p>
     <w:p>
@@ -383,8 +383,7 @@
         <w:pStyle w:val="Commarcadores"/>
       </w:pPr>
       <w:r>
-        <w:lastRenderedPageBreak/>
-        <w:t>Painel Visualizações — mostra os tipos de gráfico disponíveis (colunas, pizza, linha, mapa, tabela, cartão, etc.) e as opções de formatação do visual selecionado.</w:t>
+        <w:t>Painel Visualizações: mostra os tipos de gráfico disponíveis (colunas, pizza, linha, mapa, tabela, cartão, etc.) e as opções de formatação do visual selecionado.</w:t>
       </w:r>
     </w:p>
     <w:p>
@@ -400,7 +399,7 @@
     </w:p>
     <w:p>
       <w:r>
-        <w:t>É o espaço em branco no centro da tela de Relatório, onde os visuais são posicionados e organizados — é o seu "quadro em branco" para montar o dashboard.</w:t>
+        <w:t>É o espaço em branco no centro da tela de Relatório, onde os visuais são posicionados e organizados. É o seu "quadro em branco" para montar o dashboard.</w:t>
       </w:r>
     </w:p>
     <w:p>
@@ -472,7 +471,7 @@
         <w:pStyle w:val="Numerada"/>
       </w:pPr>
       <w:r>
-        <w:t>5. Na janela do Navegador, marque a caixa da planilha "Vendas" — uma prévia dos dados vai aparecer do lado direito.</w:t>
+        <w:t>5. Na janela do Navegador, marque a caixa da planilha "Vendas": uma prévia dos dados vai aparecer do lado direito.</w:t>
       </w:r>
     </w:p>
     <w:p>
@@ -542,7 +541,7 @@
     <w:p>
       <w:pPr/>
       <w:r>
-        <w:t>Por que assim? No gráfico de colunas, o Eixo X (horizontal) recebe a categoria que você quer comparar (Região); o Eixo Y (a altura da coluna, campo Valores) mostra o total somado de cada uma — por isso dá pra ver de cara qual região vendeu mais.</w:t>
+        <w:t>Por que assim? No gráfico de colunas, o Eixo X (horizontal) recebe a categoria que você quer comparar (Região); o Eixo Y (a altura da coluna, campo Valores) mostra o total somado de cada uma. Por isso dá pra ver de cara qual região vendeu mais.</w:t>
       </w:r>
     </w:p>
     <w:p>
@@ -577,6 +576,13 @@
         <w:lastRenderedPageBreak/>
         <w:t>Crie um visual de Total de Vendas (Valor Total) por Vendedor.</w:t>
       </w:r>
+      <w:r>
+        <w:rPr>
+          <w:i/>
+          <w:color w:val="555555"/>
+        </w:rPr>
+        <w:t xml:space="preserve"> (sugestão de gráfico: Colunas, bom para comparar valores entre várias categorias, como os 8 vendedores)</w:t>
+      </w:r>
     </w:p>
     <w:p>
       <w:pPr>
@@ -585,6 +591,13 @@
       <w:r>
         <w:t>Crie um visual de Quantidade por Categoria.</w:t>
       </w:r>
+      <w:r>
+        <w:rPr>
+          <w:i/>
+          <w:color w:val="555555"/>
+        </w:rPr>
+        <w:t xml:space="preserve"> (sugestão de gráfico: Colunas ou Pizza, já que são poucas categorias, os dois funcionam bem aqui)</w:t>
+      </w:r>
     </w:p>
     <w:p>
       <w:pPr>
@@ -593,13 +606,20 @@
       <w:r>
         <w:t>Desafio extra (se sobrar tempo): crie um terceiro visual de Total de Vendas por Canal de Venda.</w:t>
       </w:r>
+      <w:r>
+        <w:rPr>
+          <w:i/>
+          <w:color w:val="555555"/>
+        </w:rPr>
+        <w:t xml:space="preserve"> (sugestão de gráfico: Cartões, um por canal, já que só existem 2 canais; Colunas também funciona)</w:t>
+      </w:r>
     </w:p>
     <w:p>
       <w:pPr>
         <w:pStyle w:val="Commarcadores"/>
       </w:pPr>
       <w:r>
-        <w:t>Salve o arquivo como "Aula1_SeuNome.pbix" — você vai reaproveitar esse arquivo nas próximas aulas.</w:t>
+        <w:t>Salve o arquivo como "Aula1_SeuNome.pbix". Você vai reaproveitar esse arquivo nas próximas aulas.</w:t>
       </w:r>
     </w:p>
     <w:p>

</xml_diff>

<commit_message>
Preenche glossario vazio (12 aulas) e duas secoes de conteudo vazias (Aulas 6 e 11) nas apostilas do aluno
</commit_message>
<xml_diff>
--- a/Aula 01 - 01-09-2026/Aula 1 - Apostila do Aluno.docx
+++ b/Aula 01 - 01-09-2026/Aula 1 - Apostila do Aluno.docx
@@ -631,6 +631,96 @@
           <w:color w:val="1F497D"/>
         </w:rPr>
         <w:t>7. Glossário</w:t>
+      </w:r>
+    </w:p>
+    <w:p>
+      <w:pPr/>
+      <w:r>
+        <w:rPr>
+          <w:b/>
+        </w:rPr>
+        <w:t>BI (Business Intelligence)</w:t>
+      </w:r>
+    </w:p>
+    <w:p>
+      <w:pPr/>
+      <w:r>
+        <w:t>Conjunto de práticas e ferramentas para transformar dados em informação útil para decisões.</w:t>
+      </w:r>
+    </w:p>
+    <w:p>
+      <w:pPr/>
+      <w:r>
+        <w:rPr>
+          <w:b/>
+        </w:rPr>
+        <w:t>Dashboard</w:t>
+      </w:r>
+    </w:p>
+    <w:p>
+      <w:pPr/>
+      <w:r>
+        <w:t>Painel visual que reúne indicadores e gráficos para acompanhamento rápido de um assunto.</w:t>
+      </w:r>
+    </w:p>
+    <w:p>
+      <w:pPr/>
+      <w:r>
+        <w:rPr>
+          <w:b/>
+        </w:rPr>
+        <w:t>Relatório</w:t>
+      </w:r>
+    </w:p>
+    <w:p>
+      <w:pPr/>
+      <w:r>
+        <w:t>No Power BI, o conjunto de páginas com visuais construído no Desktop e publicado no Service.</w:t>
+      </w:r>
+    </w:p>
+    <w:p>
+      <w:pPr/>
+      <w:r>
+        <w:rPr>
+          <w:b/>
+        </w:rPr>
+        <w:t>Dataset (conjunto de dados)</w:t>
+      </w:r>
+    </w:p>
+    <w:p>
+      <w:pPr/>
+      <w:r>
+        <w:t>Os dados carregados e modelados dentro de um arquivo do Power BI.</w:t>
+      </w:r>
+    </w:p>
+    <w:p>
+      <w:pPr/>
+      <w:r>
+        <w:rPr>
+          <w:b/>
+        </w:rPr>
+        <w:t>Medida</w:t>
+      </w:r>
+    </w:p>
+    <w:p>
+      <w:pPr/>
+      <w:r>
+        <w:t>Cálculo (soma, média, contagem) definido em DAX, usado nos visuais. Veremos em detalhe na Aula 3.</w:t>
+      </w:r>
+    </w:p>
+    <w:p>
+      <w:pPr/>
+      <w:r>
+        <w:rPr>
+          <w:b/>
+        </w:rPr>
+        <w:t>.pbix</w:t>
+      </w:r>
+    </w:p>
+    <w:p>
+      <w:pPr/>
+      <w:r>
+        <w:t>Extensão do arquivo salvo pelo Power BI Desktop.</w:t>
       </w:r>
     </w:p>
     <w:tbl>

</xml_diff>

<commit_message>
Adiciona slide e conteudo sobre a historia do Power BI na Aula 1
</commit_message>
<xml_diff>
--- a/Aula 01 - 01-09-2026/Aula 1 - Apostila do Aluno.docx
+++ b/Aula 01 - 01-09-2026/Aula 1 - Apostila do Aluno.docx
@@ -98,6 +98,20 @@
           <w:color w:val="1F497D"/>
         </w:rPr>
         <w:t>1. O que é Business Intelligence?</w:t>
+      </w:r>
+    </w:p>
+    <w:p>
+      <w:pPr>
+        <w:pStyle w:val="Ttulo2"/>
+      </w:pPr>
+      <w:r>
+        <w:t>Breve história do Power BI</w:t>
+      </w:r>
+    </w:p>
+    <w:p>
+      <w:pPr/>
+      <w:r>
+        <w:t>O Power BI nasceu em 2010, dentro do Excel, como um conjunto de suplementos: Power Pivot (modelagem de dados), Power Query (transformação de dados) e Power View (visualização). Entre 2013 e 2014, a Microsoft reuniu essas ferramentas sob o nome "Power BI" e, em julho de 2015, lançou-o oficialmente como solução independente (standalone), já no formato que conhecemos hoje: o Power BI Desktop (para criar relatórios) e o Power BI Service (para publicar e compartilhar). Atualmente, o Power BI é referência mundial em ferramentas de BI self-service (autoatendimento) e integra o ecossistema Microsoft Fabric. Sua importância está em ter democratizado a análise de dados: recursos que antes exigiam ferramentas caras e equipes especializadas hoje estão disponíveis — inclusive em uma versão gratuita — para qualquer analista.</w:t>
       </w:r>
     </w:p>
     <w:p>
@@ -127,7 +141,23 @@
     </w:p>
     <w:p>
       <w:r>
-        <w:t xml:space="preserve">No ambiente industrial, o BI é usado, por exemplo, para acompanhar indicadores de produção, qualidade, manutenção preventiva e logística em tempo real, permitindo decisões mais rápidas e </w:t>
+        <w:t xml:space="preserve">No ambiente industrial, o BI é usado, por exemplo, para acompanhar indicadores de produção, qualidade, manutenção preventiva e logística em tempo real, permitindo decisões </w:t>
+      </w:r>
+      <w:proofErr w:type="spellStart"/>
+      <w:r>
+        <w:t>mais</w:t>
+      </w:r>
+      <w:proofErr w:type="spellEnd"/>
+      <w:r>
+        <w:t xml:space="preserve"> </w:t>
+      </w:r>
+      <w:proofErr w:type="spellStart"/>
+      <w:r>
+        <w:t>rápidas</w:t>
+      </w:r>
+      <w:proofErr w:type="spellEnd"/>
+      <w:r>
+        <w:t xml:space="preserve"> e </w:t>
       </w:r>
       <w:proofErr w:type="spellStart"/>
       <w:r>
@@ -375,6 +405,7 @@
         <w:pStyle w:val="Commarcadores"/>
       </w:pPr>
       <w:r>
+        <w:lastRenderedPageBreak/>
         <w:t>Painel Filtros: permite aplicar filtros ao relatório inteiro, a uma página ou a um visual específico.</w:t>
       </w:r>
     </w:p>
@@ -539,7 +570,6 @@
       </w:r>
     </w:p>
     <w:p>
-      <w:pPr/>
       <w:r>
         <w:t>Por que assim? No gráfico de colunas, o Eixo X (horizontal) recebe a categoria que você quer comparar (Região); o Eixo Y (a altura da coluna, campo Valores) mostra o total somado de cada uma. Por isso dá pra ver de cara qual região vendeu mais.</w:t>
       </w:r>
@@ -560,6 +590,7 @@
         <w:rPr>
           <w:color w:val="1F497D"/>
         </w:rPr>
+        <w:lastRenderedPageBreak/>
         <w:t>6. Atividade prática</w:t>
       </w:r>
     </w:p>
@@ -573,7 +604,6 @@
         <w:pStyle w:val="Commarcadores"/>
       </w:pPr>
       <w:r>
-        <w:lastRenderedPageBreak/>
         <w:t>Crie um visual de Total de Vendas (Valor Total) por Vendedor.</w:t>
       </w:r>
       <w:r>
@@ -634,7 +664,6 @@
       </w:r>
     </w:p>
     <w:p>
-      <w:pPr/>
       <w:r>
         <w:rPr>
           <w:b/>
@@ -643,13 +672,11 @@
       </w:r>
     </w:p>
     <w:p>
-      <w:pPr/>
       <w:r>
         <w:t>Conjunto de práticas e ferramentas para transformar dados em informação útil para decisões.</w:t>
       </w:r>
     </w:p>
     <w:p>
-      <w:pPr/>
       <w:r>
         <w:rPr>
           <w:b/>
@@ -658,13 +685,11 @@
       </w:r>
     </w:p>
     <w:p>
-      <w:pPr/>
       <w:r>
         <w:t>Painel visual que reúne indicadores e gráficos para acompanhamento rápido de um assunto.</w:t>
       </w:r>
     </w:p>
     <w:p>
-      <w:pPr/>
       <w:r>
         <w:rPr>
           <w:b/>
@@ -673,13 +698,11 @@
       </w:r>
     </w:p>
     <w:p>
-      <w:pPr/>
       <w:r>
         <w:t>No Power BI, o conjunto de páginas com visuais construído no Desktop e publicado no Service.</w:t>
       </w:r>
     </w:p>
     <w:p>
-      <w:pPr/>
       <w:r>
         <w:rPr>
           <w:b/>
@@ -688,13 +711,11 @@
       </w:r>
     </w:p>
     <w:p>
-      <w:pPr/>
       <w:r>
         <w:t>Os dados carregados e modelados dentro de um arquivo do Power BI.</w:t>
       </w:r>
     </w:p>
     <w:p>
-      <w:pPr/>
       <w:r>
         <w:rPr>
           <w:b/>
@@ -703,13 +724,11 @@
       </w:r>
     </w:p>
     <w:p>
-      <w:pPr/>
       <w:r>
         <w:t>Cálculo (soma, média, contagem) definido em DAX, usado nos visuais. Veremos em detalhe na Aula 3.</w:t>
       </w:r>
     </w:p>
     <w:p>
-      <w:pPr/>
       <w:r>
         <w:rPr>
           <w:b/>
@@ -718,11 +737,21 @@
       </w:r>
     </w:p>
     <w:p>
-      <w:pPr/>
       <w:r>
-        <w:t>Extensão do arquivo salvo pelo Power BI Desktop.</w:t>
+        <w:t xml:space="preserve">Extensão do arquivo salvo </w:t>
+      </w:r>
+      <w:proofErr w:type="spellStart"/>
+      <w:r>
+        <w:t>pelo</w:t>
+      </w:r>
+      <w:proofErr w:type="spellEnd"/>
+      <w:r>
+        <w:t xml:space="preserve"> Power BI Desktop.</w:t>
       </w:r>
     </w:p>
+    <w:p/>
+    <w:p/>
+    <w:p/>
     <w:tbl>
       <w:tblPr>
         <w:tblStyle w:val="Tabelacomgrade"/>
@@ -744,6 +773,7 @@
               <w:rPr>
                 <w:b/>
               </w:rPr>
+              <w:lastRenderedPageBreak/>
               <w:t>Termo</w:t>
             </w:r>
           </w:p>

</xml_diff>